<commit_message>
docs: Funktionsschaubild in drei Formaten
- architecture.svg: Vektorgrafik (druckbar, einbettbar)
- architecture.png: Rasterbild 1920px (fuer Word-Einbettung)
- architecture.md: Mermaid-Diagramm (GitHub-Rendering)
- Word-Dokument: Schaubild als Abbildung 1 vor Kapitel 1 eingebaut
</commit_message>
<xml_diff>
--- a/docs/Systemuebersicht-DRK-MV-KI-Plattform.docx
+++ b/docs/Systemuebersicht-DRK-MV-KI-Plattform.docx
@@ -305,6 +305,69 @@
           <w:szCs w:val="32"/>
         </w:rPr>
         <w:t xml:space="preserve">1  Architektur-Überblick</w:t>
+      </w:r>
+    </w:p>
+    <w:p>
+      <w:pPr>
+        <w:spacing w:after="80" w:before="120"/>
+        <w:jc w:val="center"/>
+      </w:pPr>
+      <w:r>
+        <w:drawing>
+          <wp:inline distT="0" distB="0" distL="0" distR="0">
+            <wp:extent cx="5905500" cy="4429125"/>
+            <wp:effectExtent t="0" r="0" b="0" l="0"/>
+            <wp:docPr id="1" name="architecture" descr="Systemarchitektur DRK MV KI-Plattform" title="Funktionsschaubild"/>
+            <wp:cNvGraphicFramePr>
+              <a:graphicFrameLocks xmlns:a="http://schemas.openxmlformats.org/drawingml/2006/main" noChangeAspect="1"/>
+            </wp:cNvGraphicFramePr>
+            <a:graphic xmlns:a="http://schemas.openxmlformats.org/drawingml/2006/main">
+              <a:graphicData uri="http://schemas.openxmlformats.org/drawingml/2006/picture">
+                <pic:pic xmlns:pic="http://schemas.openxmlformats.org/drawingml/2006/picture">
+                  <pic:nvPicPr>
+                    <pic:cNvPr id="0" name="" descr=""/>
+                    <pic:cNvPicPr>
+                      <a:picLocks noChangeAspect="1" noChangeArrowheads="1"/>
+                    </pic:cNvPicPr>
+                  </pic:nvPicPr>
+                  <pic:blipFill>
+                    <a:blip r:embed="rId9" cstate="none"/>
+                    <a:srcRect/>
+                    <a:stretch>
+                      <a:fillRect/>
+                    </a:stretch>
+                  </pic:blipFill>
+                  <pic:spPr bwMode="auto">
+                    <a:xfrm>
+                      <a:off x="0" y="0"/>
+                      <a:ext cx="5905500" cy="4429125"/>
+                    </a:xfrm>
+                    <a:prstGeom prst="rect">
+                      <a:avLst/>
+                    </a:prstGeom>
+                  </pic:spPr>
+                </pic:pic>
+              </a:graphicData>
+            </a:graphic>
+          </wp:inline>
+        </w:drawing>
+      </w:r>
+    </w:p>
+    <w:p>
+      <w:pPr>
+        <w:spacing w:after="200"/>
+        <w:jc w:val="center"/>
+      </w:pPr>
+      <w:r>
+        <w:rPr>
+          <w:rFonts w:ascii="Arial" w:cs="Arial" w:eastAsia="Arial" w:hAnsi="Arial"/>
+          <w:i/>
+          <w:iCs/>
+          <w:color w:val="555555"/>
+          <w:sz w:val="18"/>
+          <w:szCs w:val="18"/>
+        </w:rPr>
+        <w:t xml:space="preserve">Abbildung 1: Funktionsschaubild DRK MV KI-Plattform</w:t>
       </w:r>
     </w:p>
     <w:p>

</xml_diff>